<commit_message>
lower IO_POKER_BATCH_REQ to 10 for low-throughput NetPoke runs
</commit_message>
<xml_diff>
--- a/netpoke/thesis/final/Chapter_1_NetPoke.docx
+++ b/netpoke/thesis/final/Chapter_1_NetPoke.docx
@@ -8,8 +8,6 @@
         <w:spacing w:before="0"/>
         <w:jc w:val="both"/>
       </w:pPr>
-      <w:bookmarkStart w:id="0" w:name="_GoBack"/>
-      <w:bookmarkEnd w:id="0"/>
       <w:r>
         <w:t>Chapter 1: Introduction</w:t>
       </w:r>
@@ -1002,12 +1000,20 @@
       <w:pPr>
         <w:pStyle w:val="Heading2"/>
         <w:spacing w:line="480" w:lineRule="auto"/>
-        <w:jc w:val="both"/>
-        <w:rPr>
-          <w:b w:val="0"/>
-          <w:sz w:val="24"/>
-        </w:rPr>
-      </w:pPr>
+        <w:ind w:left="720" w:hanging="720"/>
+        <w:jc w:val="both"/>
+        <w:rPr>
+          <w:b w:val="0"/>
+          <w:sz w:val="24"/>
+        </w:rPr>
+      </w:pPr>
+      <w:r>
+        <w:rPr>
+          <w:b w:val="0"/>
+          <w:sz w:val="24"/>
+        </w:rPr>
+        <w:t xml:space="preserve">RQ1: </w:t>
+      </w:r>
       <w:r>
         <w:rPr>
           <w:b w:val="0"/>
@@ -1047,23 +1053,19 @@
         </w:rPr>
         <w:t xml:space="preserve"> prediction error worse?</w:t>
       </w:r>
-    </w:p>
-    <w:p>
-      <w:pPr>
-        <w:pStyle w:val="Heading2"/>
-        <w:spacing w:line="480" w:lineRule="auto"/>
-        <w:jc w:val="both"/>
-        <w:rPr>
-          <w:b w:val="0"/>
-          <w:sz w:val="24"/>
-        </w:rPr>
-      </w:pPr>
-      <w:r>
-        <w:rPr>
-          <w:b w:val="0"/>
-          <w:sz w:val="24"/>
-        </w:rPr>
-        <w:t>RQ1: Is I/O-</w:t>
+      <w:r>
+        <w:rPr>
+          <w:b w:val="0"/>
+          <w:sz w:val="24"/>
+        </w:rPr>
+        <w:t xml:space="preserve"> </w:t>
+      </w:r>
+      <w:r>
+        <w:rPr>
+          <w:b w:val="0"/>
+          <w:sz w:val="24"/>
+        </w:rPr>
+        <w:t>Is I/O-</w:t>
       </w:r>
       <w:proofErr w:type="spellStart"/>
       <w:r>
@@ -1102,6 +1104,7 @@
       <w:pPr>
         <w:pStyle w:val="Heading2"/>
         <w:spacing w:line="480" w:lineRule="auto"/>
+        <w:ind w:left="720" w:hanging="720"/>
         <w:jc w:val="both"/>
         <w:rPr>
           <w:b w:val="0"/>
@@ -1148,6 +1151,7 @@
       <w:pPr>
         <w:pStyle w:val="Heading2"/>
         <w:spacing w:line="480" w:lineRule="auto"/>
+        <w:ind w:left="720" w:hanging="720"/>
         <w:jc w:val="both"/>
         <w:rPr>
           <w:b w:val="0"/>
@@ -1197,6 +1201,7 @@
       <w:pPr>
         <w:pStyle w:val="Heading2"/>
         <w:spacing w:line="480" w:lineRule="auto"/>
+        <w:ind w:left="720" w:hanging="720"/>
         <w:jc w:val="both"/>
         <w:rPr>
           <w:b w:val="0"/>
@@ -1388,7 +1393,16 @@
           <w:b w:val="0"/>
           <w:sz w:val="24"/>
         </w:rPr>
-        <w:t xml:space="preserve"> that engineers can confidently evaluate. Optimization of database queries, caching policy, connection pool sizes and synchronous call elimination all are now subjects of what-if analysis instead of guesswork. The real benefit is one of engineering cycles saved; </w:t>
+        <w:t xml:space="preserve"> that engineers can confidently evaluate. Optimization of database queries, caching policy, connection pool sizes and synchronous call elimination all are now subjects of what-if analysis instead </w:t>
+      </w:r>
+      <w:bookmarkStart w:id="0" w:name="_GoBack"/>
+      <w:bookmarkEnd w:id="0"/>
+      <w:r>
+        <w:rPr>
+          <w:b w:val="0"/>
+          <w:sz w:val="24"/>
+        </w:rPr>
+        <w:t xml:space="preserve">of guesswork. The real benefit is one of engineering cycles saved; </w:t>
       </w:r>
       <w:proofErr w:type="spellStart"/>
       <w:r>
@@ -2711,7 +2725,7 @@
           <w:rPr>
             <w:noProof/>
           </w:rPr>
-          <w:t>1</w:t>
+          <w:t>7</w:t>
         </w:r>
         <w:r>
           <w:rPr>

</xml_diff>